<commit_message>
Add work authorization line to resume
</commit_message>
<xml_diff>
--- a/Mohammed_Umair_Khan_Resume.docx
+++ b/Mohammed_Umair_Khan_Resume.docx
@@ -98,6 +98,20 @@
           <w:color w:val="1F3A5F"/>
         </w:rPr>
         <w:t>SOFTWARE ENGINEER  |  AI SOLUTIONS ENGINEER  |  PLATFORM ENGINEER</w:t>
+      </w:r>
+    </w:p>
+    <w:p>
+      <w:pPr>
+        <w:spacing w:after="80"/>
+        <w:jc w:val="center"/>
+      </w:pPr>
+      <w:r>
+        <w:rPr>
+          <w:i/>
+          <w:color w:val="444444"/>
+          <w:sz w:val="19"/>
+        </w:rPr>
+        <w:t>Authorized to work in the U.S. — no sponsorship required</w:t>
       </w:r>
     </w:p>
     <w:p>

</xml_diff>